<commit_message>
Upload final submitted project plan
</commit_message>
<xml_diff>
--- a/project_plan/unsw-ZZSC9020-Project-Plan-2026 H2 Group A 20260323 Final.docx
+++ b/project_plan/unsw-ZZSC9020-Project-Plan-2026 H2 Group A 20260323 Final.docx
@@ -249,7 +249,7 @@
           <w:r>
             <w:fldChar w:fldCharType="separate"/>
           </w:r>
-          <w:hyperlink w:anchor="_Toc225096130" w:history="1">
+          <w:hyperlink w:anchor="_Toc225173032" w:history="1">
             <w:r>
               <w:rPr>
                 <w:rStyle w:val="Hyperlink"/>
@@ -293,7 +293,7 @@
                 <w:noProof/>
                 <w:webHidden/>
               </w:rPr>
-              <w:instrText xml:space="preserve"> PAGEREF _Toc225096130 \h </w:instrText>
+              <w:instrText xml:space="preserve"> PAGEREF _Toc225173032 \h </w:instrText>
             </w:r>
             <w:r>
               <w:rPr>
@@ -339,7 +339,7 @@
               <w14:ligatures w14:val="standardContextual"/>
             </w:rPr>
           </w:pPr>
-          <w:hyperlink w:anchor="_Toc225096131" w:history="1">
+          <w:hyperlink w:anchor="_Toc225173033" w:history="1">
             <w:r>
               <w:rPr>
                 <w:rStyle w:val="Hyperlink"/>
@@ -383,7 +383,7 @@
                 <w:noProof/>
                 <w:webHidden/>
               </w:rPr>
-              <w:instrText xml:space="preserve"> PAGEREF _Toc225096131 \h </w:instrText>
+              <w:instrText xml:space="preserve"> PAGEREF _Toc225173033 \h </w:instrText>
             </w:r>
             <w:r>
               <w:rPr>
@@ -429,7 +429,7 @@
               <w14:ligatures w14:val="standardContextual"/>
             </w:rPr>
           </w:pPr>
-          <w:hyperlink w:anchor="_Toc225096132" w:history="1">
+          <w:hyperlink w:anchor="_Toc225173034" w:history="1">
             <w:r>
               <w:rPr>
                 <w:rStyle w:val="Hyperlink"/>
@@ -473,7 +473,7 @@
                 <w:noProof/>
                 <w:webHidden/>
               </w:rPr>
-              <w:instrText xml:space="preserve"> PAGEREF _Toc225096132 \h </w:instrText>
+              <w:instrText xml:space="preserve"> PAGEREF _Toc225173034 \h </w:instrText>
             </w:r>
             <w:r>
               <w:rPr>
@@ -519,7 +519,7 @@
               <w14:ligatures w14:val="standardContextual"/>
             </w:rPr>
           </w:pPr>
-          <w:hyperlink w:anchor="_Toc225096133" w:history="1">
+          <w:hyperlink w:anchor="_Toc225173035" w:history="1">
             <w:r>
               <w:rPr>
                 <w:rStyle w:val="Hyperlink"/>
@@ -563,7 +563,7 @@
                 <w:noProof/>
                 <w:webHidden/>
               </w:rPr>
-              <w:instrText xml:space="preserve"> PAGEREF _Toc225096133 \h </w:instrText>
+              <w:instrText xml:space="preserve"> PAGEREF _Toc225173035 \h </w:instrText>
             </w:r>
             <w:r>
               <w:rPr>
@@ -609,7 +609,7 @@
               <w14:ligatures w14:val="standardContextual"/>
             </w:rPr>
           </w:pPr>
-          <w:hyperlink w:anchor="_Toc225096134" w:history="1">
+          <w:hyperlink w:anchor="_Toc225173036" w:history="1">
             <w:r>
               <w:rPr>
                 <w:rStyle w:val="Hyperlink"/>
@@ -653,7 +653,7 @@
                 <w:noProof/>
                 <w:webHidden/>
               </w:rPr>
-              <w:instrText xml:space="preserve"> PAGEREF _Toc225096134 \h </w:instrText>
+              <w:instrText xml:space="preserve"> PAGEREF _Toc225173036 \h </w:instrText>
             </w:r>
             <w:r>
               <w:rPr>
@@ -698,7 +698,7 @@
               <w14:ligatures w14:val="standardContextual"/>
             </w:rPr>
           </w:pPr>
-          <w:hyperlink w:anchor="_Toc225096135" w:history="1">
+          <w:hyperlink w:anchor="_Toc225173037" w:history="1">
             <w:r>
               <w:rPr>
                 <w:rStyle w:val="Hyperlink"/>
@@ -725,7 +725,7 @@
                 <w:noProof/>
                 <w:webHidden/>
               </w:rPr>
-              <w:instrText xml:space="preserve"> PAGEREF _Toc225096135 \h </w:instrText>
+              <w:instrText xml:space="preserve"> PAGEREF _Toc225173037 \h </w:instrText>
             </w:r>
             <w:r>
               <w:rPr>
@@ -770,7 +770,7 @@
               <w14:ligatures w14:val="standardContextual"/>
             </w:rPr>
           </w:pPr>
-          <w:hyperlink w:anchor="_Toc225096136" w:history="1">
+          <w:hyperlink w:anchor="_Toc225173038" w:history="1">
             <w:r>
               <w:rPr>
                 <w:rStyle w:val="Hyperlink"/>
@@ -797,7 +797,7 @@
                 <w:noProof/>
                 <w:webHidden/>
               </w:rPr>
-              <w:instrText xml:space="preserve"> PAGEREF _Toc225096136 \h </w:instrText>
+              <w:instrText xml:space="preserve"> PAGEREF _Toc225173038 \h </w:instrText>
             </w:r>
             <w:r>
               <w:rPr>
@@ -842,7 +842,7 @@
               <w14:ligatures w14:val="standardContextual"/>
             </w:rPr>
           </w:pPr>
-          <w:hyperlink w:anchor="_Toc225096137" w:history="1">
+          <w:hyperlink w:anchor="_Toc225173039" w:history="1">
             <w:r>
               <w:rPr>
                 <w:rStyle w:val="Hyperlink"/>
@@ -869,7 +869,7 @@
                 <w:noProof/>
                 <w:webHidden/>
               </w:rPr>
-              <w:instrText xml:space="preserve"> PAGEREF _Toc225096137 \h </w:instrText>
+              <w:instrText xml:space="preserve"> PAGEREF _Toc225173039 \h </w:instrText>
             </w:r>
             <w:r>
               <w:rPr>
@@ -914,7 +914,7 @@
               <w14:ligatures w14:val="standardContextual"/>
             </w:rPr>
           </w:pPr>
-          <w:hyperlink w:anchor="_Toc225096138" w:history="1">
+          <w:hyperlink w:anchor="_Toc225173040" w:history="1">
             <w:r>
               <w:rPr>
                 <w:rStyle w:val="Hyperlink"/>
@@ -941,7 +941,7 @@
                 <w:noProof/>
                 <w:webHidden/>
               </w:rPr>
-              <w:instrText xml:space="preserve"> PAGEREF _Toc225096138 \h </w:instrText>
+              <w:instrText xml:space="preserve"> PAGEREF _Toc225173040 \h </w:instrText>
             </w:r>
             <w:r>
               <w:rPr>
@@ -998,7 +998,7 @@
           <w:footerReference w:type="default" r:id="rId9"/>
           <w:footerReference w:type="first" r:id="rId10"/>
           <w:pgSz w:w="12240" w:h="15840"/>
-          <w:pgMar w:top="851" w:right="1440" w:bottom="1440" w:left="1440" w:header="568" w:footer="96" w:gutter="0"/>
+          <w:pgMar w:top="851" w:right="1440" w:bottom="1135" w:left="1440" w:header="568" w:footer="96" w:gutter="0"/>
           <w:cols w:space="720"/>
           <w:titlePg/>
           <w:docGrid w:linePitch="326"/>
@@ -1008,9 +1008,9 @@
     <w:p>
       <w:pPr>
         <w:pStyle w:val="Heading2"/>
-        <w:spacing w:before="0" w:after="240"/>
-      </w:pPr>
-      <w:bookmarkStart w:id="1" w:name="_Toc225096130"/>
+        <w:spacing w:before="0"/>
+      </w:pPr>
+      <w:bookmarkStart w:id="1" w:name="_Toc225173032"/>
       <w:r>
         <w:rPr>
           <w:rStyle w:val="SectionNumber"/>
@@ -1174,7 +1174,10 @@
         <w:ind w:left="284" w:hanging="284"/>
       </w:pPr>
       <w:r>
-        <w:t>Statistical time series models (e.g., ARIMA/SARIMA),</w:t>
+        <w:t>Statistical time ser</w:t>
+      </w:r>
+      <w:r>
+        <w:t>ies models (e.g., ARIMA/SARIMA),</w:t>
       </w:r>
     </w:p>
     <w:p>
@@ -1246,7 +1249,55 @@
         <w:rPr>
           <w:lang w:val="en-AU"/>
         </w:rPr>
-        <w:t xml:space="preserve"> steps at hourly intervals (i.e., 2 to 30 days). This range is motivated by existing literature while also reflecting practical requirements for electricity providers, such as load planning and participation in energy markets (Feinberg et al., 2005; Hong et al., 2016).</w:t>
+        <w:t xml:space="preserve"> steps at hourly intervals (i.e., 2 to 30 days). </w:t>
+      </w:r>
+      <w:r>
+        <w:rPr>
+          <w:lang w:val="en-AU"/>
+        </w:rPr>
+        <w:t>The selected forecasting horizons are consistent with prior benchmark studies</w:t>
+      </w:r>
+      <w:r>
+        <w:rPr>
+          <w:lang w:val="en-AU"/>
+        </w:rPr>
+        <w:t xml:space="preserve"> (Li et al., 2022)</w:t>
+      </w:r>
+      <w:r>
+        <w:rPr>
+          <w:lang w:val="en-AU"/>
+        </w:rPr>
+        <w:t>, ensuring comparability with existing literature</w:t>
+      </w:r>
+      <w:r>
+        <w:rPr>
+          <w:lang w:val="en-AU"/>
+        </w:rPr>
+        <w:t>.</w:t>
+      </w:r>
+      <w:r>
+        <w:rPr>
+          <w:lang w:val="en-AU"/>
+        </w:rPr>
+        <w:t xml:space="preserve"> </w:t>
+      </w:r>
+      <w:r>
+        <w:rPr>
+          <w:lang w:val="en-AU"/>
+        </w:rPr>
+        <w:t>This range also reflect</w:t>
+      </w:r>
+      <w:r>
+        <w:rPr>
+          <w:lang w:val="en-AU"/>
+        </w:rPr>
+        <w:t>s</w:t>
+      </w:r>
+      <w:r>
+        <w:rPr>
+          <w:lang w:val="en-AU"/>
+        </w:rPr>
+        <w:t xml:space="preserve"> practical requirements for electricity providers, such as load planning and participation in energy markets (Feinberg et al., 2005; Hong et al., 2016).</w:t>
       </w:r>
     </w:p>
     <w:p>
@@ -1262,9 +1313,9 @@
     <w:p>
       <w:pPr>
         <w:pStyle w:val="Heading2"/>
-        <w:spacing w:before="0" w:after="240"/>
-      </w:pPr>
-      <w:bookmarkStart w:id="2" w:name="_Toc225096131"/>
+        <w:spacing w:before="0"/>
+      </w:pPr>
+      <w:bookmarkStart w:id="2" w:name="_Toc225173033"/>
       <w:r>
         <w:rPr>
           <w:rStyle w:val="SectionNumber"/>
@@ -1303,11 +1354,7 @@
       </w:r>
       <w:proofErr w:type="spellEnd"/>
       <w:r>
-        <w:t xml:space="preserve">, 1997). In the context of electricity demand, LSTM models have shown strong performance when incorporating exogenous variables such as temperature, as well as lagged demand and calendar features. Studies such as Kong et al. (2017) and Marino et al. (2016) </w:t>
-      </w:r>
-      <w:r>
-        <w:lastRenderedPageBreak/>
-        <w:t>demonstrate that LSTMs can outperform traditional statistical models in short-term forecasting by effectively learning nonlinear demand patterns and temporal dependencies.</w:t>
+        <w:t>, 1997). In the context of electricity demand, LSTM models have shown strong performance when incorporating exogenous variables such as temperature, as well as lagged demand and calendar features. Studies such as Kong et al. (2017) and Marino et al. (2016) demonstrate that LSTMs can outperform traditional statistical models in short-term forecasting by effectively learning nonlinear demand patterns and temporal dependencies.</w:t>
       </w:r>
     </w:p>
     <w:p>
@@ -1315,6 +1362,7 @@
         <w:jc w:val="both"/>
       </w:pPr>
       <w:r>
+        <w:lastRenderedPageBreak/>
         <w:t xml:space="preserve">Despite their advantages, LSTM models have limitations when applied to medium- and long-term forecasting horizons. While they </w:t>
       </w:r>
       <w:proofErr w:type="gramStart"/>
@@ -1355,10 +1403,7 @@
       </w:r>
       <w:proofErr w:type="spellEnd"/>
       <w:r>
-        <w:t xml:space="preserve"> (Nie et al., 2023), have addressed some of these limitations by introducing techniques such as patching and channel independence, improving performance on long-horizon forecasting benchmarks. These advancements suggest that transformer-based models may be more competitive when appropriately adapted for time series da</w:t>
-      </w:r>
-      <w:r>
-        <w:t>ta.</w:t>
+        <w:t xml:space="preserve"> (Nie et al., 2023), have addressed some of these limitations by introducing techniques such as patching and channel independence, improving performance on long-horizon forecasting benchmarks. These advancements suggest that transformer-based models may be more competitive when appropriately adapted for time series data.</w:t>
       </w:r>
     </w:p>
     <w:p>
@@ -1391,7 +1436,41 @@
       </w:r>
       <w:proofErr w:type="gramEnd"/>
       <w:r>
-        <w:t xml:space="preserve"> for long-term forecasting but require careful design and sufficient data to outperform simpler approaches. </w:t>
+        <w:t xml:space="preserve"> for long-term forecasting but require careful design and sufficient data to outperform simpler approaches.</w:t>
+      </w:r>
+      <w:r>
+        <w:t xml:space="preserve"> </w:t>
+      </w:r>
+      <w:proofErr w:type="spellStart"/>
+      <w:r>
+        <w:t>PatchTST</w:t>
+      </w:r>
+      <w:proofErr w:type="spellEnd"/>
+      <w:r>
+        <w:t xml:space="preserve"> introduces patching and channel independence to improve long-horizon forecasting performance and reduce overfitting</w:t>
+      </w:r>
+      <w:r>
+        <w:t xml:space="preserve">. </w:t>
+      </w:r>
+      <w:r>
+        <w:t xml:space="preserve">In addition, prior studies such as Nie et al. (2023) primarily benchmark </w:t>
+      </w:r>
+      <w:proofErr w:type="spellStart"/>
+      <w:r>
+        <w:t>PatchTST</w:t>
+      </w:r>
+      <w:proofErr w:type="spellEnd"/>
+      <w:r>
+        <w:t xml:space="preserve"> against deep learning and linear</w:t>
+      </w:r>
+      <w:r>
+        <w:t xml:space="preserve"> machine learning</w:t>
+      </w:r>
+      <w:r>
+        <w:t xml:space="preserve"> models, with limited comparison to classical statistical models such as SARIMAX or recurrent models such as LSTM. This study addresses this gap by evaluating these model families under a consistent forecasting framework</w:t>
+      </w:r>
+      <w:r>
+        <w:t>.</w:t>
       </w:r>
     </w:p>
     <w:p>
@@ -1403,9 +1482,9 @@
     <w:p>
       <w:pPr>
         <w:pStyle w:val="Heading2"/>
-        <w:spacing w:before="0" w:after="240"/>
-      </w:pPr>
-      <w:bookmarkStart w:id="3" w:name="_Toc225096132"/>
+        <w:spacing w:before="0"/>
+      </w:pPr>
+      <w:bookmarkStart w:id="3" w:name="_Toc225173034"/>
       <w:r>
         <w:rPr>
           <w:rStyle w:val="SectionNumber"/>
@@ -1710,6 +1789,7 @@
           <w:bCs/>
           <w:lang w:val="en-HK"/>
         </w:rPr>
+        <w:lastRenderedPageBreak/>
         <w:t>Explanatory Variables:</w:t>
       </w:r>
       <w:r>
@@ -1746,14 +1826,7 @@
         <w:rPr>
           <w:lang w:val="en-HK"/>
         </w:rPr>
-        <w:t xml:space="preserve">Incorporating these variables is expected to improve forecasting accuracy by explicitly </w:t>
-      </w:r>
-      <w:r>
-        <w:rPr>
-          <w:lang w:val="en-HK"/>
-        </w:rPr>
-        <w:lastRenderedPageBreak/>
-        <w:t>capturing seasonal and behavioural consumption patterns.</w:t>
+        <w:t>Incorporating these variables is expected to improve forecasting accuracy by explicitly capturing seasonal and behavioural consumption patterns.</w:t>
       </w:r>
       <w:r>
         <w:rPr>
@@ -2068,7 +2141,7 @@
     <w:p>
       <w:pPr>
         <w:pStyle w:val="BodyText"/>
-        <w:spacing w:before="0"/>
+        <w:spacing w:before="0" w:after="0"/>
         <w:jc w:val="both"/>
       </w:pPr>
       <w:bookmarkStart w:id="5" w:name="activities-and-schedule"/>
@@ -2156,12 +2229,12 @@
     <w:p>
       <w:pPr>
         <w:pStyle w:val="Heading2"/>
-        <w:spacing w:before="0" w:afterLines="50" w:after="120"/>
+        <w:spacing w:before="0"/>
         <w:rPr>
           <w:rStyle w:val="SectionNumber"/>
         </w:rPr>
       </w:pPr>
-      <w:bookmarkStart w:id="6" w:name="_Toc225096133"/>
+      <w:bookmarkStart w:id="6" w:name="_Toc225173035"/>
       <w:r>
         <w:rPr>
           <w:rStyle w:val="SectionNumber"/>
@@ -2377,7 +2450,7 @@
           <w:ilvl w:val="0"/>
           <w:numId w:val="18"/>
         </w:numPr>
-        <w:spacing w:before="0"/>
+        <w:spacing w:before="0" w:after="0"/>
         <w:ind w:left="284" w:hanging="284"/>
       </w:pPr>
       <w:r>
@@ -2419,7 +2492,7 @@
           <w:rStyle w:val="SectionNumber"/>
         </w:rPr>
       </w:pPr>
-      <w:bookmarkStart w:id="8" w:name="_Toc225096134"/>
+      <w:bookmarkStart w:id="8" w:name="_Toc225173036"/>
       <w:r>
         <w:rPr>
           <w:rStyle w:val="SectionNumber"/>
@@ -2529,7 +2602,7 @@
         <w:pStyle w:val="Heading2"/>
         <w:spacing w:before="0" w:after="240"/>
       </w:pPr>
-      <w:bookmarkStart w:id="9" w:name="_Toc225096135"/>
+      <w:bookmarkStart w:id="9" w:name="_Toc225173037"/>
       <w:r>
         <w:rPr>
           <w:rStyle w:val="SectionNumber"/>
@@ -3621,7 +3694,7 @@
         <w:pStyle w:val="Heading2"/>
         <w:spacing w:before="0" w:after="240"/>
       </w:pPr>
-      <w:bookmarkStart w:id="10" w:name="_Toc225096136"/>
+      <w:bookmarkStart w:id="10" w:name="_Toc225173038"/>
       <w:r>
         <w:rPr>
           <w:rStyle w:val="SectionNumber"/>
@@ -3769,7 +3842,7 @@
         <w:pStyle w:val="Heading2"/>
         <w:spacing w:before="0" w:after="240"/>
       </w:pPr>
-      <w:bookmarkStart w:id="11" w:name="_Toc225096137"/>
+      <w:bookmarkStart w:id="11" w:name="_Toc225173039"/>
       <w:r>
         <w:rPr>
           <w:rStyle w:val="SectionNumber"/>
@@ -4645,7 +4718,7 @@
         <w:pStyle w:val="Heading1"/>
         <w:spacing w:before="0" w:after="240"/>
       </w:pPr>
-      <w:bookmarkStart w:id="15" w:name="_Toc225096138"/>
+      <w:bookmarkStart w:id="15" w:name="_Toc225173040"/>
       <w:r>
         <w:lastRenderedPageBreak/>
         <w:t>References</w:t>
@@ -4749,7 +4822,14 @@
           <w:i/>
           <w:iCs/>
         </w:rPr>
-        <w:t>IEEE Transactions on Power Systems</w:t>
+        <w:t>IEEE</w:t>
+      </w:r>
+      <w:r>
+        <w:rPr>
+          <w:i/>
+          <w:iCs/>
+        </w:rPr>
+        <w:t xml:space="preserve"> Transactions on Power Systems</w:t>
       </w:r>
       <w:r>
         <w:t>, 16(1), pp. 44–55.</w:t>
@@ -4760,10 +4840,7 @@
         <w:jc w:val="both"/>
       </w:pPr>
       <w:r>
-        <w:t>5.</w:t>
-      </w:r>
-      <w:r>
-        <w:t xml:space="preserve">  Kong, W. et al. (2017), ‘Short-term residential load forecasting based on LSTM’, </w:t>
+        <w:t xml:space="preserve">5.  Kong, W. et al. (2017), ‘Short-term residential load forecasting based on LSTM’, </w:t>
       </w:r>
       <w:r>
         <w:rPr>
@@ -4781,28 +4858,20 @@
         <w:jc w:val="both"/>
       </w:pPr>
       <w:r>
-        <w:t>6.</w:t>
-      </w:r>
-      <w:r>
-        <w:t xml:space="preserve"> Li, H., Shao, J., Liao, K. and Tang, M. (2022</w:t>
-      </w:r>
-      <w:proofErr w:type="gramStart"/>
-      <w:r>
-        <w:t>), ‘</w:t>
-      </w:r>
-      <w:proofErr w:type="gramEnd"/>
-      <w:r>
-        <w:t xml:space="preserve">Do simpler statistical methods perform better in multivariate long sequence time-series forecasting?’, </w:t>
+        <w:t xml:space="preserve">6. </w:t>
+      </w:r>
+      <w:r>
+        <w:t xml:space="preserve">Li, H., Shao, J., Liao, K. and Tang, M. (2022), ‘Do simpler statistical methods perform better in multivariate long sequence time-series forecasting?’, </w:t>
       </w:r>
       <w:r>
         <w:rPr>
           <w:i/>
           <w:iCs/>
         </w:rPr>
-        <w:t>CIKM</w:t>
-      </w:r>
-      <w:r>
-        <w:t>.</w:t>
+        <w:t>Proceedings of the 31st ACM International Conference on Information and Knowledge Management (CIKM)</w:t>
+      </w:r>
+      <w:r>
+        <w:t>, pp. 4168–4172.</w:t>
       </w:r>
     </w:p>
     <w:p>
@@ -4810,28 +4879,20 @@
         <w:jc w:val="both"/>
       </w:pPr>
       <w:r>
-        <w:t>7.</w:t>
-      </w:r>
-      <w:r>
-        <w:t xml:space="preserve"> Marino, D.L., Amarasinghe, K. and Manic, M. (2016</w:t>
-      </w:r>
-      <w:proofErr w:type="gramStart"/>
-      <w:r>
-        <w:t>), ‘</w:t>
-      </w:r>
-      <w:proofErr w:type="gramEnd"/>
-      <w:r>
-        <w:t xml:space="preserve">Building energy load forecasting using deep neural networks’, </w:t>
+        <w:t xml:space="preserve">7. </w:t>
+      </w:r>
+      <w:r>
+        <w:t xml:space="preserve">Marino, D.L., Amarasinghe, K. and Manic, M. (2016), ‘Building energy load forecasting using deep neural networks’, </w:t>
       </w:r>
       <w:r>
         <w:rPr>
           <w:i/>
           <w:iCs/>
         </w:rPr>
-        <w:t>IEEE IECON</w:t>
-      </w:r>
-      <w:r>
-        <w:t>.</w:t>
+        <w:t xml:space="preserve">Proceedings of the IEEE Industrial Electronics Conference (IECON), </w:t>
+      </w:r>
+      <w:r>
+        <w:t>pp. 7046–7051.</w:t>
       </w:r>
     </w:p>
     <w:p>
@@ -4839,20 +4900,28 @@
         <w:jc w:val="both"/>
       </w:pPr>
       <w:r>
-        <w:t>8.</w:t>
-      </w:r>
-      <w:r>
-        <w:t xml:space="preserve"> Nie, Y. et al. (2023), </w:t>
+        <w:t xml:space="preserve">8. </w:t>
+      </w:r>
+      <w:r>
+        <w:t>Nie, Y. et al. (2023</w:t>
+      </w:r>
+      <w:proofErr w:type="gramStart"/>
+      <w:r>
+        <w:t>), ‘</w:t>
+      </w:r>
+      <w:proofErr w:type="gramEnd"/>
+      <w:r>
+        <w:t xml:space="preserve">A time series is worth 64 words: Long-term forecasting with transformers’, </w:t>
       </w:r>
       <w:r>
         <w:rPr>
           <w:i/>
           <w:iCs/>
         </w:rPr>
-        <w:t>A Time Series is Worth 64 Words: Long-term Forecasting with Transformers</w:t>
-      </w:r>
-      <w:r>
-        <w:t>, ICLR.</w:t>
+        <w:t>Proceedings of the International Conference on Learning Representations (ICLR)</w:t>
+      </w:r>
+      <w:r>
+        <w:t>.</w:t>
       </w:r>
     </w:p>
     <w:p>
@@ -4860,10 +4929,7 @@
         <w:jc w:val="both"/>
       </w:pPr>
       <w:r>
-        <w:t>9.</w:t>
-      </w:r>
-      <w:r>
-        <w:t xml:space="preserve">  </w:t>
+        <w:t xml:space="preserve">9. </w:t>
       </w:r>
       <w:proofErr w:type="spellStart"/>
       <w:r>
@@ -4871,17 +4937,26 @@
       </w:r>
       <w:proofErr w:type="spellEnd"/>
       <w:r>
-        <w:t xml:space="preserve">, P. and Dudek, G. (2020), </w:t>
-      </w:r>
+        <w:t xml:space="preserve">, P. and Dudek, G. (2020), ‘Pattern-based LSTM for mid-term electrical load forecasting’, </w:t>
+      </w:r>
+      <w:proofErr w:type="spellStart"/>
       <w:r>
         <w:rPr>
           <w:i/>
           <w:iCs/>
         </w:rPr>
-        <w:t>Pattern-based LSTM for mid-term electrical load forecasting</w:t>
-      </w:r>
-      <w:r>
-        <w:t>, arXiv:2004.11834.</w:t>
+        <w:t>arXiv</w:t>
+      </w:r>
+      <w:proofErr w:type="spellEnd"/>
+      <w:r>
+        <w:rPr>
+          <w:i/>
+          <w:iCs/>
+        </w:rPr>
+        <w:t xml:space="preserve"> [online]. Available at: https://arxiv.org/abs/2004.11834</w:t>
+      </w:r>
+      <w:r>
+        <w:t xml:space="preserve"> (Accessed: 23 March 2026).</w:t>
       </w:r>
     </w:p>
     <w:p>
@@ -4889,10 +4964,7 @@
         <w:jc w:val="both"/>
       </w:pPr>
       <w:r>
-        <w:t xml:space="preserve">10. </w:t>
-      </w:r>
-      <w:r>
-        <w:t xml:space="preserve"> Taylor, J.W. (2003), ‘Short-term electricity demand forecasting using double seasonal exponential smoothing’, </w:t>
+        <w:t xml:space="preserve">10.  Taylor, J.W. (2003), ‘Short-term electricity demand forecasting using double seasonal exponential smoothing’, </w:t>
       </w:r>
       <w:r>
         <w:rPr>
@@ -4910,10 +4982,17 @@
         <w:jc w:val="both"/>
       </w:pPr>
       <w:r>
-        <w:t>11.</w:t>
-      </w:r>
-      <w:r>
-        <w:t xml:space="preserve"> Vaswani, A. et al. (2017), ‘Attention is all you need’, </w:t>
+        <w:t xml:space="preserve">11. </w:t>
+      </w:r>
+      <w:r>
+        <w:t xml:space="preserve">Vaswani, A. et al. (2017), ‘Attention is all you need’, </w:t>
+      </w:r>
+      <w:r>
+        <w:rPr>
+          <w:i/>
+          <w:iCs/>
+        </w:rPr>
+        <w:t>Advances in Neural Information Processing Systems (</w:t>
       </w:r>
       <w:proofErr w:type="spellStart"/>
       <w:r>
@@ -4925,40 +5004,62 @@
       </w:r>
       <w:proofErr w:type="spellEnd"/>
       <w:r>
-        <w:t>.</w:t>
-      </w:r>
-    </w:p>
-    <w:p>
-      <w:pPr>
-        <w:jc w:val="both"/>
-      </w:pPr>
-      <w:r>
-        <w:t>12.</w:t>
-      </w:r>
-      <w:r>
-        <w:t xml:space="preserve"> Zeng, A. et al. (2022), </w:t>
-      </w:r>
-      <w:r>
         <w:rPr>
           <w:i/>
           <w:iCs/>
         </w:rPr>
-        <w:t xml:space="preserve">Are transformers effective for time series </w:t>
-      </w:r>
-      <w:proofErr w:type="gramStart"/>
+        <w:t xml:space="preserve">), </w:t>
+      </w:r>
+      <w:r>
+        <w:t>30,</w:t>
+      </w:r>
       <w:r>
         <w:rPr>
           <w:i/>
           <w:iCs/>
         </w:rPr>
-        <w:t>forecasting?</w:t>
-      </w:r>
-      <w:r>
-        <w:t>,</w:t>
+        <w:t xml:space="preserve"> </w:t>
+      </w:r>
+      <w:r>
+        <w:t>pp. 5998–6008.</w:t>
+      </w:r>
+    </w:p>
+    <w:p>
+      <w:pPr>
+        <w:jc w:val="both"/>
+      </w:pPr>
+      <w:r>
+        <w:t xml:space="preserve">12. </w:t>
+      </w:r>
+      <w:r>
+        <w:t>Zeng, A. et al. (2022</w:t>
+      </w:r>
+      <w:proofErr w:type="gramStart"/>
+      <w:r>
+        <w:t>), ‘</w:t>
       </w:r>
       <w:proofErr w:type="gramEnd"/>
       <w:r>
-        <w:t xml:space="preserve"> arXiv:2205.13504.</w:t>
+        <w:t xml:space="preserve">Are transformers effective for time series forecasting?’, </w:t>
+      </w:r>
+      <w:proofErr w:type="spellStart"/>
+      <w:r>
+        <w:rPr>
+          <w:i/>
+          <w:iCs/>
+        </w:rPr>
+        <w:t>arXiv</w:t>
+      </w:r>
+      <w:proofErr w:type="spellEnd"/>
+      <w:r>
+        <w:rPr>
+          <w:i/>
+          <w:iCs/>
+        </w:rPr>
+        <w:t xml:space="preserve"> [online]. Available at: https://arxiv.org/abs/2205.13504 </w:t>
+      </w:r>
+      <w:r>
+        <w:t>(Accessed: 23 March 2026).</w:t>
       </w:r>
     </w:p>
     <w:p>
@@ -4970,7 +5071,7 @@
       <w:footerReference w:type="default" r:id="rId13"/>
       <w:footerReference w:type="first" r:id="rId14"/>
       <w:pgSz w:w="12240" w:h="15840"/>
-      <w:pgMar w:top="993" w:right="1041" w:bottom="993" w:left="993" w:header="720" w:footer="96" w:gutter="0"/>
+      <w:pgMar w:top="993" w:right="1041" w:bottom="851" w:left="993" w:header="720" w:footer="96" w:gutter="0"/>
       <w:cols w:space="720"/>
       <w:titlePg/>
       <w:docGrid w:linePitch="326"/>
@@ -17650,7 +17751,6 @@
   <w:style w:type="character" w:default="1" w:styleId="DefaultParagraphFont">
     <w:name w:val="Default Paragraph Font"/>
     <w:uiPriority w:val="1"/>
-    <w:semiHidden/>
     <w:unhideWhenUsed/>
   </w:style>
   <w:style w:type="table" w:default="1" w:styleId="TableNormal">

</xml_diff>